<commit_message>
Regenerer le rapport et le guide technique avec des chiffres a jour
Les deux .docx n'avaient pas ete regeneres depuis longtemps : nombre
de tests fige a 489/337 selon les sections (622 reellement), nombre
de phases fige a 21 (46 reellement), une ligne de credit "brief hors
suivi git" devenue fausse (Documentation/planning/ est bien
versionne). generate_docs.py corrige sur ces points, puis les deux
documents regeneres pour de vrai (python Documentation/reports/generate_docs.py),
verifies par lecture programmatique du contenu produit plutot que
supposes a jour.

Co-Authored-By: Claude Sonnet 5 <noreply@anthropic.com>
</commit_message>
<xml_diff>
--- a/Documentation/reports/Guide_Technique_DevoTeam_Dashboard.docx
+++ b/Documentation/reports/Guide_Technique_DevoTeam_Dashboard.docx
@@ -394,7 +394,7 @@
         <w:br/>
         <w:t>backend/llm.py :: parse_user_query()</w:t>
         <w:br/>
-        <w:t xml:space="preserve">   │  parseur rapide (mots-clés) OU appel Gemini + validation Pydantic</w:t>
+        <w:t xml:space="preserve">   │  parseur rapide (mots-clés) OU appel Ollama (local) + validation Pydantic</w:t>
         <w:br/>
         <w:t xml:space="preserve">   │  résolution des filtres (fuzzy match) contre les données réelles</w:t>
         <w:br/>
@@ -1321,7 +1321,7 @@
               <w:rPr>
                 <w:sz w:val="19"/>
               </w:rPr>
-              <w:t>Suite pytest — 489 tests, aucune dépendance réseau ni données réelles.</w:t>
+              <w:t>Suite pytest — 622 tests, aucune dépendance réseau ni données réelles.</w:t>
             </w:r>
           </w:p>
         </w:tc>
@@ -1415,7 +1415,7 @@
               <w:rPr>
                 <w:sz w:val="19"/>
               </w:rPr>
-              <w:t>Brief initial du projet et données sources (hors suivi git du dépôt).</w:t>
+              <w:t>Brief initial du projet et données sources (archive historique, versionnée).</w:t>
             </w:r>
           </w:p>
         </w:tc>
@@ -1445,7 +1445,7 @@
           <w:b w:val="0"/>
           <w:i w:val="0"/>
         </w:rPr>
-        <w:t>Il n'y a plus de base de données. Le Google Sheet est la source de vérité : `data_store.py` le lit via l'API Google (gspread), valide chaque ligne, et construit un DataFrame pandas conservé en mémoire. Ce DataFrame est rafraîchi toutes les 15 minutes, au démarrage, et à la demande via POST /sheets/sync.</w:t>
+        <w:t>Il n'y a plus de base de données. Le Google Sheet est la source de vérité : `data_store.py` le lit en lecture seule via son lien d'export public (aucune clé API, aucun compte de service, aucun fichier JSON), valide chaque ligne, et construit un DataFrame pandas conservé en mémoire. Ce DataFrame est rafraîchi toutes les 15 minutes, au démarrage, et à la demande via POST /sheets/sync.</w:t>
       </w:r>
     </w:p>
     <w:p>
@@ -2357,7 +2357,7 @@
           <w:b w:val="0"/>
           <w:i w:val="0"/>
         </w:rPr>
-        <w:t>try_rule_based_parse() (intent_refiner.py) reconnaît par mots-clés fixes les cas simples (practice, statut, métrique, dimension). Il n'est utilisé que s'il n'y a pas de contexte de conversation précédent, et seulement après passage par _augment_rule_based_result(), qui refuse de lui faire confiance dès qu'une comparaison ou plusieurs pays sont mentionnés (retour à None → bascule vers le LLM). Dans tous les autres cas, l'appel Gemini (llm.py) prend le relais, avec le contexte multi-tour injecté dans le prompt système.</w:t>
+        <w:t>try_rule_based_parse() (intent_refiner.py) reconnaît par mots-clés fixes les cas simples (practice, statut, métrique, dimension). Il n'est utilisé que s'il n'y a pas de contexte de conversation précédent, et seulement après passage par _augment_rule_based_result(), qui refuse de lui faire confiance dès qu'une comparaison ou plusieurs pays sont mentionnés (retour à None → bascule vers le LLM). Dans tous les autres cas, l'appel au modèle local (Ollama, llm.py) prend le relais, avec le contexte multi-tour injecté dans le prompt système.</w:t>
       </w:r>
     </w:p>
     <w:p>
@@ -4405,7 +4405,7 @@
           <w:color w:val="242422"/>
           <w:sz w:val="27"/>
         </w:rPr>
-        <w:t>12.3 Authentification Google — compte de service, pas clé API</w:t>
+        <w:t>12.3 Authentification Google — aucune, lien d'export public</w:t>
       </w:r>
     </w:p>
     <w:p>
@@ -4414,7 +4414,7 @@
           <w:b w:val="0"/>
           <w:i w:val="0"/>
         </w:rPr>
-        <w:t>L'application doit pouvoir ÉCRIRE dans le Sheet (identifiants des nouvelles lignes et colonnes calculées, section 4.3), ce qu'une simple clé API ne permet pas — elle est en lecture seule. L'accès passe donc par un compte de service Google (fichier JSON, ajouté en Éditeur sur le Sheet cible).</w:t>
+        <w:t>L'application ne lit plus le Sheet qu'en LECTURE — elle n'y écrit plus les identifiants des nouvelles lignes ni les colonnes calculées, qui restent affichées dans les tableaux de bord sans jamais être renvoyées vers Google (section 4.3). Aucun identifiant n'est donc nécessaire : un appel HTTP vers le lien d'export CSV public du Sheet (`/gviz/tq?tqx=out:csv`, le même mécanisme que « Fichier → Télécharger → CSV »), sans clé API, sans fichier de compte de service, sans OAuth. Contrepartie assumée : le Sheet doit être partagé en Lecteur, « toute personne disposant du lien » — et un nom d'onglet incorrect ne produit AUCUNE erreur, Google retombe silencieusement sur le premier onglet de la feuille (mitigé par la vérification des colonnes attendues juste après la lecture, seul filet de sécurité disponible ici).</w:t>
       </w:r>
     </w:p>
     <w:p>
@@ -4423,7 +4423,7 @@
           <w:b w:val="0"/>
           <w:i w:val="0"/>
         </w:rPr>
-        <w:t>Optimisation mesurée : la résolution du Sheet (open_by_key puis worksheet) coûte deux allers-retours réseau, soit 1,6 s, et était rejouée à chaque cycle alors que le client authentifié, lui, était déjà mis en cache. Mettre aussi en cache l'objet Worksheet fait tomber ce coût à zéro sur les appels suivants — un chargement complet passe de ~1,1 s à ~0,4 s. Le profilage avait d'ailleurs démenti l'intuition de départ : les écritures en base ne représentaient que 0,03 s, l'essentiel du temps était réseau.</w:t>
+        <w:t>Ce choix a remplacé une authentification par clé API Sheets v4 restreinte (elle-même remplaçante d'un compte de service, fichier JSON partagé en Éditeur sur le Sheet cible) — chaque étape supprimant une pièce d'identité de plus à faire circuler, la dernière ne demandant plus rien du tout côté Google Cloud Console. L'appel HTTP au lien d'export n'a rien à mettre en cache entre deux chargements, contrairement au client authentifié qu'il remplace.</w:t>
       </w:r>
     </w:p>
     <w:p>
@@ -4698,7 +4698,7 @@
         <w:pStyle w:val="ListBullet"/>
       </w:pPr>
       <w:r>
-        <w:t>.env (clés API, identifiants email) exclu du suivi git via .gitignore ; .env.example documente les variables attendues sans valeurs réelles.</w:t>
+        <w:t>.env (identifiants email) exclu du suivi git via .gitignore ; .env.example documente les variables attendues sans valeurs réelles.</w:t>
       </w:r>
     </w:p>
     <w:p>
@@ -4714,7 +4714,7 @@
         <w:pStyle w:val="ListBullet"/>
       </w:pPr>
       <w:r>
-        <w:t>credentials/ (clé de compte de service Google, section 11.1) est gitignoré au niveau du dossier entier — jamais de fichier JSON de credentials commité, quel que soit son nom.</w:t>
+        <w:t>La lecture du Sheet (section 12.3) ne passe par aucun identifiant à protéger : le lien d'export public n'existe que parce que le Sheet est déjà partagé « toute personne disposant du lien », exactement l'inverse d'un secret.</w:t>
       </w:r>
     </w:p>
     <w:p>
@@ -4740,7 +4740,7 @@
           <w:b w:val="0"/>
           <w:i w:val="0"/>
         </w:rPr>
-        <w:t>337 tests pytest, sans dépendance réseau ni données réelles : le client Gemini et le client Google Sheets (gspread) sont simulés (monkeypatch), et les données sont un petit DataFrame construit dans le test. La suite tourne donc hors ligne, en quelques secondes.</w:t>
+        <w:t>622 tests pytest, sans dépendance réseau ni données réelles : le client du modèle local (Ollama) et l'appel HTTP au lien d'export du Sheet sont simulés (monkeypatch), et les données sont un petit DataFrame construit dans le test. La suite tourne donc hors ligne, en quelques secondes.</w:t>
       </w:r>
     </w:p>
     <w:p>
@@ -4749,7 +4749,7 @@
           <w:b w:val="0"/>
           <w:i w:val="0"/>
         </w:rPr>
-        <w:t>Ces tests sont systématiquement complétés par une vérification en conditions réelles — Sheet réel, appel Gemini réel, exécution effective de chaque widget via `dac check`. La répartition des rôles est nette : les tests protègent contre les régressions, la vérification réelle est ce qui a révélé la quasi-totalité des vrais bugs de ce projet (sections 8.3 et 15).</w:t>
+        <w:t>Ces tests sont systématiquement complétés par une vérification en conditions réelles — Sheet réel, appel au modèle local réel, exécution effective de chaque widget via `dac check`. La répartition des rôles est nette : les tests protègent contre les régressions, la vérification réelle est ce qui a révélé la quasi-totalité des vrais bugs de ce projet (sections 8.3 et 15).</w:t>
       </w:r>
     </w:p>
     <w:tbl>
@@ -6112,7 +6112,7 @@
         <w:pStyle w:val="ListBullet"/>
       </w:pPr>
       <w:r>
-        <w:t>Google Gemini (fournisseur actuel depuis la migration forcée, section 2.2) supporte en fait les sorties structurées strictes (vérifié empiriquement), mais l'app garde volontairement l'architecture JSON libre héritée de Groq — le filet de sécurité Pydantic + liste blanche reste donc le mécanisme d'application des règles, plutôt qu'une garantie au niveau du schéma du modèle. Adopter le mode strict resterait une amélioration possible.</w:t>
+        <w:t>Ollama, le fournisseur actuel (local, remplaçant Gemini — section 2.2), supporte aussi les sorties structurées strictes (un JSON Schema, pas seulement le mode "json" libre utilisé aujourd'hui), mais l'app garde volontairement l'architecture JSON libre héritée des fournisseurs précédents (Groq, Gemini) — le filet de sécurité Pydantic + liste blanche reste donc le mécanisme d'application des règles, plutôt qu'une garantie au niveau du schéma du modèle. Adopter le mode strict resterait une amélioration possible.</w:t>
       </w:r>
     </w:p>
     <w:p>

</xml_diff>